<commit_message>
agrupar funciones de transformación de texto e hipervínculos; add soporte en notas prólogo (footnotes.xml)
</commit_message>
<xml_diff>
--- a/test/test_notas.docx
+++ b/test/test_notas.docx
@@ -111,7 +111,28 @@
         <w:rPr>
           <w:lang w:val="es-ES_tradnl"/>
         </w:rPr>
-        <w:t xml:space="preserve">.  </w:t>
+        <w:t xml:space="preserve">. </w:t>
+      </w:r>
+      <w:r>
+        <w:rPr>
+          <w:lang w:val="es-ES_tradnl"/>
+        </w:rPr>
+        <w:t xml:space="preserve">También puedes incluir </w:t>
+      </w:r>
+      <w:hyperlink r:id="rId4" w:history="1">
+        <w:r>
+          <w:rPr>
+            <w:rStyle w:val="Hipervnculo"/>
+            <w:lang w:val="es-ES_tradnl"/>
+          </w:rPr>
+          <w:t>enlaces</w:t>
+        </w:r>
+      </w:hyperlink>
+      <w:r>
+        <w:rPr>
+          <w:lang w:val="es-ES_tradnl"/>
+        </w:rPr>
+        <w:t>.</w:t>
       </w:r>
     </w:p>
     <w:p>
@@ -205,6 +226,144 @@
         </w:rPr>
         <w:t>, que repite el número de verso.</w:t>
       </w:r>
+    </w:p>
+    <w:tbl>
+      <w:tblPr>
+        <w:tblStyle w:val="Tablaconcuadrcula"/>
+        <w:tblW w:w="0" w:type="auto"/>
+        <w:tblLook w:val="04A0" w:firstRow="1" w:lastRow="0" w:firstColumn="1" w:lastColumn="0" w:noHBand="0" w:noVBand="1"/>
+      </w:tblPr>
+      <w:tblGrid>
+        <w:gridCol w:w="2829"/>
+        <w:gridCol w:w="2829"/>
+        <w:gridCol w:w="2830"/>
+      </w:tblGrid>
+      <w:tr>
+        <w:tc>
+          <w:tcPr>
+            <w:tcW w:w="2829" w:type="dxa"/>
+          </w:tcPr>
+          <w:p>
+            <w:pPr>
+              <w:spacing w:after="240"/>
+              <w:rPr>
+                <w:lang w:val="es-ES_tradnl"/>
+              </w:rPr>
+            </w:pPr>
+            <w:r>
+              <w:rPr>
+                <w:lang w:val="es-ES_tradnl"/>
+              </w:rPr>
+              <w:t>Ejemplo</w:t>
+            </w:r>
+          </w:p>
+        </w:tc>
+        <w:tc>
+          <w:tcPr>
+            <w:tcW w:w="2829" w:type="dxa"/>
+          </w:tcPr>
+          <w:p>
+            <w:pPr>
+              <w:spacing w:after="240"/>
+              <w:rPr>
+                <w:lang w:val="es-ES_tradnl"/>
+              </w:rPr>
+            </w:pPr>
+            <w:r>
+              <w:rPr>
+                <w:lang w:val="es-ES_tradnl"/>
+              </w:rPr>
+              <w:t>Ejemplo</w:t>
+            </w:r>
+          </w:p>
+        </w:tc>
+        <w:tc>
+          <w:tcPr>
+            <w:tcW w:w="2830" w:type="dxa"/>
+          </w:tcPr>
+          <w:p>
+            <w:pPr>
+              <w:spacing w:after="240"/>
+              <w:rPr>
+                <w:lang w:val="es-ES_tradnl"/>
+              </w:rPr>
+            </w:pPr>
+            <w:r>
+              <w:rPr>
+                <w:lang w:val="es-ES_tradnl"/>
+              </w:rPr>
+              <w:t>Ejemplo</w:t>
+            </w:r>
+          </w:p>
+        </w:tc>
+      </w:tr>
+      <w:tr>
+        <w:tc>
+          <w:tcPr>
+            <w:tcW w:w="2829" w:type="dxa"/>
+          </w:tcPr>
+          <w:p>
+            <w:pPr>
+              <w:spacing w:after="240"/>
+              <w:rPr>
+                <w:lang w:val="es-ES_tradnl"/>
+              </w:rPr>
+            </w:pPr>
+            <w:r>
+              <w:rPr>
+                <w:lang w:val="es-ES_tradnl"/>
+              </w:rPr>
+              <w:t>Ejemplo</w:t>
+            </w:r>
+          </w:p>
+        </w:tc>
+        <w:tc>
+          <w:tcPr>
+            <w:tcW w:w="2829" w:type="dxa"/>
+          </w:tcPr>
+          <w:p>
+            <w:pPr>
+              <w:spacing w:after="240"/>
+              <w:rPr>
+                <w:lang w:val="es-ES_tradnl"/>
+              </w:rPr>
+            </w:pPr>
+            <w:r>
+              <w:rPr>
+                <w:lang w:val="es-ES_tradnl"/>
+              </w:rPr>
+              <w:t>Ejemplo</w:t>
+            </w:r>
+          </w:p>
+        </w:tc>
+        <w:tc>
+          <w:tcPr>
+            <w:tcW w:w="2830" w:type="dxa"/>
+          </w:tcPr>
+          <w:p>
+            <w:pPr>
+              <w:spacing w:after="240"/>
+              <w:rPr>
+                <w:lang w:val="es-ES_tradnl"/>
+              </w:rPr>
+            </w:pPr>
+            <w:r>
+              <w:rPr>
+                <w:lang w:val="es-ES_tradnl"/>
+              </w:rPr>
+              <w:t>Ejemplo</w:t>
+            </w:r>
+          </w:p>
+        </w:tc>
+      </w:tr>
+    </w:tbl>
+    <w:p>
+      <w:pPr>
+        <w:spacing w:after="240"/>
+        <w:rPr>
+          <w:lang w:val="es-ES_tradnl"/>
+        </w:rPr>
+      </w:pPr>
     </w:p>
     <w:p>
       <w:pPr>
@@ -1317,6 +1476,48 @@
       <w:spacing w:val="5"/>
     </w:rPr>
   </w:style>
+  <w:style w:type="table" w:styleId="Tablaconcuadrcula">
+    <w:name w:val="Table Grid"/>
+    <w:basedOn w:val="Tablanormal"/>
+    <w:uiPriority w:val="39"/>
+    <w:rsid w:val="00C8252F"/>
+    <w:pPr>
+      <w:spacing w:after="0" w:line="240" w:lineRule="auto"/>
+    </w:pPr>
+    <w:tblPr>
+      <w:tblBorders>
+        <w:top w:val="single" w:sz="4" w:space="0" w:color="auto"/>
+        <w:left w:val="single" w:sz="4" w:space="0" w:color="auto"/>
+        <w:bottom w:val="single" w:sz="4" w:space="0" w:color="auto"/>
+        <w:right w:val="single" w:sz="4" w:space="0" w:color="auto"/>
+        <w:insideH w:val="single" w:sz="4" w:space="0" w:color="auto"/>
+        <w:insideV w:val="single" w:sz="4" w:space="0" w:color="auto"/>
+      </w:tblBorders>
+    </w:tblPr>
+  </w:style>
+  <w:style w:type="character" w:styleId="Hipervnculo">
+    <w:name w:val="Hyperlink"/>
+    <w:basedOn w:val="Fuentedeprrafopredeter"/>
+    <w:uiPriority w:val="99"/>
+    <w:unhideWhenUsed/>
+    <w:rsid w:val="00D749C2"/>
+    <w:rPr>
+      <w:color w:val="467886" w:themeColor="hyperlink"/>
+      <w:u w:val="single"/>
+    </w:rPr>
+  </w:style>
+  <w:style w:type="character" w:styleId="Mencinsinresolver">
+    <w:name w:val="Unresolved Mention"/>
+    <w:basedOn w:val="Fuentedeprrafopredeter"/>
+    <w:uiPriority w:val="99"/>
+    <w:semiHidden/>
+    <w:unhideWhenUsed/>
+    <w:rsid w:val="00D749C2"/>
+    <w:rPr>
+      <w:color w:val="605E5C"/>
+      <w:shd w:val="clear" w:color="auto" w:fill="E1DFDD"/>
+    </w:rPr>
+  </w:style>
 </w:styles>
 </file>
 

</xml_diff>